<commit_message>
fix: update plan for realization
</commit_message>
<xml_diff>
--- a/Plan_Rakendus.docx
+++ b/Plan_Rakendus.docx
@@ -623,6 +623,21 @@
     <w:p>
       <w:pPr>
         <w:rPr>
+          <w:lang w:val="ru-RU"/>
+        </w:rPr>
+      </w:pPr>
+      <w:r>
+        <w:rPr>
+          <w:highlight w:val="yellow"/>
+          <w:lang w:val="ru-RU"/>
+        </w:rPr>
+        <w:t>Ориентировочный файл – что надо реализовать.</w:t>
+      </w:r>
+    </w:p>
+    <w:p/>
+    <w:p>
+      <w:pPr>
+        <w:rPr>
           <w:lang w:val="ru-UA"/>
         </w:rPr>
       </w:pPr>
@@ -686,6 +701,12 @@
           <w:lang w:val="ru-UA"/>
         </w:rPr>
       </w:pPr>
+      <w:r>
+        <w:rPr>
+          <w:lang w:val="ru-UA"/>
+        </w:rPr>
+        <w:t>======================================================================================</w:t>
+      </w:r>
     </w:p>
     <w:p>
       <w:pPr>
@@ -883,6 +904,19 @@
           <w:lang w:val="ru-UA"/>
         </w:rPr>
         <w:t>Где используется: Индикаторы статуса заказа, успешные сообщения.</w:t>
+      </w:r>
+    </w:p>
+    <w:p>
+      <w:pPr>
+        <w:rPr>
+          <w:lang w:val="ru-UA"/>
+        </w:rPr>
+      </w:pPr>
+      <w:r>
+        <w:rPr>
+          <w:lang w:val="ru-UA"/>
+        </w:rPr>
+        <w:t>======================================================================================</w:t>
       </w:r>
     </w:p>
     <w:p>
@@ -1190,15 +1224,30 @@
     <w:p>
       <w:pPr>
         <w:rPr>
-          <w:lang w:val="ru-UA"/>
-        </w:rPr>
-      </w:pPr>
-      <w:r>
-        <w:rPr>
-          <w:b/>
-          <w:bCs/>
-          <w:lang w:val="ru-UA"/>
-        </w:rPr>
+          <w:lang w:val="ru-RU"/>
+        </w:rPr>
+      </w:pPr>
+    </w:p>
+    <w:p>
+      <w:pPr>
+        <w:rPr>
+          <w:lang w:val="ru-RU"/>
+        </w:rPr>
+      </w:pPr>
+    </w:p>
+    <w:p>
+      <w:pPr>
+        <w:rPr>
+          <w:lang w:val="ru-UA"/>
+        </w:rPr>
+      </w:pPr>
+      <w:r>
+        <w:rPr>
+          <w:b/>
+          <w:bCs/>
+          <w:lang w:val="ru-UA"/>
+        </w:rPr>
+        <w:lastRenderedPageBreak/>
         <w:t>Два перечисления (enum):</w:t>
       </w:r>
     </w:p>
@@ -1248,24 +1297,23 @@
     <w:p>
       <w:pPr>
         <w:rPr>
-          <w:b/>
-          <w:bCs/>
-        </w:rPr>
-      </w:pPr>
-    </w:p>
-    <w:p>
-      <w:pPr>
-        <w:rPr>
-          <w:lang w:val="ru-UA"/>
-        </w:rPr>
-      </w:pPr>
-      <w:r>
-        <w:rPr>
-          <w:b/>
-          <w:bCs/>
-          <w:lang w:val="ru-UA"/>
-        </w:rPr>
-        <w:lastRenderedPageBreak/>
+          <w:lang w:val="ru-UA"/>
+        </w:rPr>
+      </w:pPr>
+      <w:r>
+        <w:rPr>
+          <w:b/>
+          <w:bCs/>
+          <w:lang w:val="ru-UA"/>
+        </w:rPr>
+        <w:t>с</w:t>
+      </w:r>
+      <w:r>
+        <w:rPr>
+          <w:b/>
+          <w:bCs/>
+          <w:lang w:val="ru-UA"/>
+        </w:rPr>
         <w:t>Логическая связь:</w:t>
       </w:r>
     </w:p>
@@ -1289,6 +1337,15 @@
     <w:p>
       <w:pPr>
         <w:rPr>
+          <w:b/>
+          <w:bCs/>
+          <w:lang w:val="ru-UA"/>
+        </w:rPr>
+      </w:pPr>
+    </w:p>
+    <w:p>
+      <w:pPr>
+        <w:rPr>
           <w:lang w:val="ru-UA"/>
         </w:rPr>
       </w:pPr>
@@ -1328,14 +1385,6 @@
         </w:rPr>
         <w:t>:</w:t>
       </w:r>
-    </w:p>
-    <w:p>
-      <w:pPr>
-        <w:ind w:left="720"/>
-        <w:rPr>
-          <w:lang w:val="ru-RU"/>
-        </w:rPr>
-      </w:pPr>
     </w:p>
     <w:p>
       <w:pPr>
@@ -2019,98 +2068,83 @@
     <w:p>
       <w:pPr>
         <w:ind w:left="720"/>
-      </w:pPr>
-    </w:p>
-    <w:p>
-      <w:pPr>
-        <w:rPr>
-          <w:b/>
-          <w:bCs/>
+        <w:rPr>
           <w:lang w:val="ru-RU"/>
         </w:rPr>
       </w:pPr>
-      <w:r>
-        <w:rPr>
-          <w:b/>
-          <w:bCs/>
-        </w:rPr>
+    </w:p>
+    <w:p>
+      <w:pPr>
+        <w:ind w:left="720"/>
+        <w:rPr>
+          <w:lang w:val="ru-RU"/>
+        </w:rPr>
+      </w:pPr>
+    </w:p>
+    <w:p>
+      <w:pPr>
+        <w:ind w:left="720"/>
+        <w:rPr>
+          <w:lang w:val="ru-RU"/>
+        </w:rPr>
+      </w:pPr>
+    </w:p>
+    <w:p>
+      <w:pPr>
+        <w:ind w:left="720"/>
+        <w:rPr>
+          <w:lang w:val="ru-RU"/>
+        </w:rPr>
+      </w:pPr>
+    </w:p>
+    <w:p>
+      <w:pPr>
+        <w:rPr>
+          <w:b/>
+          <w:bCs/>
+          <w:lang w:val="ru-RU"/>
+        </w:rPr>
+      </w:pPr>
+      <w:r>
+        <w:rPr>
+          <w:b/>
+          <w:bCs/>
+        </w:rPr>
+        <w:lastRenderedPageBreak/>
         <w:t>Шаг 2. Защита на уровне Core и исключений</w:t>
       </w:r>
-    </w:p>
-    <w:p>
-      <w:pPr>
-        <w:rPr>
+      <w:r>
+        <w:rPr>
+          <w:b/>
+          <w:bCs/>
           <w:lang w:val="ru-RU"/>
         </w:rPr>
-      </w:pPr>
-      <w:r>
-        <w:t>В проекте Core создается кастомный класс исключения DomainException. В статическом методе валидации заказа перед сохранением выполняется проверка параметров:</w:t>
-      </w:r>
-    </w:p>
-    <w:p>
-      <w:pPr>
-        <w:ind w:left="851"/>
+        <w:t xml:space="preserve"> – обработчик ошибок.</w:t>
+      </w:r>
+    </w:p>
+    <w:p>
+      <w:pPr>
+        <w:rPr>
+          <w:lang w:val="ru-RU"/>
+        </w:rPr>
+      </w:pPr>
+      <w:r>
+        <w:t>В проекте Core создается кастомный класс исключения DomainException. В статическом методе валидации заказа перед сохранением выполняется проверка параметров</w:t>
+      </w:r>
+      <w:r>
+        <w:rPr>
+          <w:lang w:val="ru-RU"/>
+        </w:rPr>
+        <w:t>.</w:t>
+      </w:r>
+    </w:p>
+    <w:p>
+      <w:pPr>
         <w:rPr>
           <w:lang w:val="en-US"/>
         </w:rPr>
       </w:pPr>
       <w:r>
-        <w:rPr>
-          <w:lang w:val="en-US"/>
-        </w:rPr>
-        <w:t>if (order.Size == PizzaSize.Small &amp;&amp; order.SauceCount &gt; 3)</w:t>
-      </w:r>
-    </w:p>
-    <w:p>
-      <w:pPr>
-        <w:ind w:left="851"/>
-        <w:rPr>
-          <w:lang w:val="en-US"/>
-        </w:rPr>
-      </w:pPr>
-      <w:r>
-        <w:rPr>
-          <w:lang w:val="en-US"/>
-        </w:rPr>
-        <w:t>{</w:t>
-      </w:r>
-    </w:p>
-    <w:p>
-      <w:pPr>
-        <w:ind w:left="851"/>
-        <w:rPr>
-          <w:lang w:val="en-US"/>
-        </w:rPr>
-      </w:pPr>
-      <w:r>
-        <w:rPr>
-          <w:lang w:val="en-US"/>
-        </w:rPr>
-        <w:t xml:space="preserve">    throw new DomainException("Error_TooManySaucesForSmallPizza");</w:t>
-      </w:r>
-    </w:p>
-    <w:p>
-      <w:pPr>
-        <w:ind w:left="851"/>
-        <w:rPr>
-          <w:lang w:val="en-US"/>
-        </w:rPr>
-      </w:pPr>
-      <w:r>
-        <w:rPr>
-          <w:lang w:val="en-US"/>
-        </w:rPr>
-        <w:t>}</w:t>
-      </w:r>
-    </w:p>
-    <w:p>
-      <w:pPr>
-        <w:rPr>
-          <w:lang w:val="en-US"/>
-        </w:rPr>
-      </w:pPr>
-      <w:r>
-        <w:lastRenderedPageBreak/>
         <w:t xml:space="preserve">Если это правило нарушается, WPF в блоке </w:t>
       </w:r>
       <w:r>
@@ -2343,21 +2377,40 @@
           <w:bCs/>
           <w:lang w:val="ru-UA"/>
         </w:rPr>
-        <w:t xml:space="preserve"> - </w:t>
-      </w:r>
-      <w:r>
-        <w:rPr>
-          <w:lang w:val="ru-UA"/>
-        </w:rPr>
-        <w:t>PizzaManager (или PizzaService).</w:t>
-      </w:r>
-    </w:p>
-    <w:p>
-      <w:pPr>
-        <w:numPr>
-          <w:ilvl w:val="0"/>
-          <w:numId w:val="15"/>
-        </w:numPr>
+        <w:t xml:space="preserve"> </w:t>
+      </w:r>
+      <w:r>
+        <w:rPr>
+          <w:b/>
+          <w:bCs/>
+          <w:lang w:val="ru-UA"/>
+        </w:rPr>
+        <w:t>–</w:t>
+      </w:r>
+      <w:r>
+        <w:rPr>
+          <w:b/>
+          <w:bCs/>
+          <w:lang w:val="ru-UA"/>
+        </w:rPr>
+        <w:t xml:space="preserve"> </w:t>
+      </w:r>
+      <w:r>
+        <w:rPr>
+          <w:lang w:val="ru-UA"/>
+        </w:rPr>
+        <w:t>PizzaManager</w:t>
+      </w:r>
+      <w:r>
+        <w:rPr>
+          <w:lang w:val="ru-UA"/>
+        </w:rPr>
+        <w:t>.</w:t>
+      </w:r>
+    </w:p>
+    <w:p>
+      <w:pPr>
+        <w:ind w:left="426"/>
         <w:rPr>
           <w:lang w:val="ru-UA"/>
         </w:rPr>
@@ -2806,26 +2859,248 @@
     </w:p>
     <w:p>
       <w:pPr>
+        <w:ind w:left="426"/>
+        <w:rPr>
+          <w:lang w:val="ru-RU"/>
+        </w:rPr>
+      </w:pPr>
+      <w:r>
+        <w:t>Когда пользователь нажимает кнопку «Сохранить» в диалоговом окне WPF, вызывается метод добавления из проекта Core.</w:t>
+      </w:r>
+    </w:p>
+    <w:p>
+      <w:pPr>
+        <w:ind w:left="426"/>
+        <w:rPr>
+          <w:lang w:val="ru-RU"/>
+        </w:rPr>
+      </w:pPr>
+    </w:p>
+    <w:p>
+      <w:pPr>
+        <w:ind w:left="426"/>
+        <w:rPr>
+          <w:lang w:val="ru-RU"/>
+        </w:rPr>
+      </w:pPr>
+      <w:r>
+        <w:rPr>
+          <w:b/>
+          <w:bCs/>
+          <w:lang w:val="ru-RU"/>
+        </w:rPr>
+        <w:t xml:space="preserve">1) </w:t>
+      </w:r>
+      <w:r>
+        <w:rPr>
+          <w:b/>
+          <w:bCs/>
+        </w:rPr>
+        <w:t>Проверка вместимости:</w:t>
+      </w:r>
+      <w:r>
+        <w:t xml:space="preserve"> </w:t>
+      </w:r>
+      <w:r>
+        <w:rPr>
+          <w:lang w:val="ru-RU"/>
+        </w:rPr>
+        <w:t>с</w:t>
+      </w:r>
+      <w:r>
+        <w:t>начала метод проверяет, не заполнился ли массив до отказа</w:t>
+      </w:r>
+      <w:r>
+        <w:rPr>
+          <w:lang w:val="ru-RU"/>
+        </w:rPr>
+        <w:t>.</w:t>
+      </w:r>
+    </w:p>
+    <w:p>
+      <w:pPr>
+        <w:ind w:left="426"/>
+        <w:rPr>
+          <w:lang w:val="ru-RU"/>
+        </w:rPr>
+      </w:pPr>
+      <w:r>
+        <w:rPr>
+          <w:b/>
+          <w:bCs/>
+          <w:lang w:val="ru-RU"/>
+        </w:rPr>
+        <w:t xml:space="preserve">2) </w:t>
+      </w:r>
+      <w:r>
+        <w:rPr>
+          <w:b/>
+          <w:bCs/>
+        </w:rPr>
+        <w:t>Запись в ячейку:</w:t>
+      </w:r>
+      <w:r>
+        <w:t xml:space="preserve"> </w:t>
+      </w:r>
+      <w:r>
+        <w:rPr>
+          <w:lang w:val="ru-RU"/>
+        </w:rPr>
+        <w:t>е</w:t>
+      </w:r>
+      <w:r>
+        <w:t>сли место есть, новый заказ помещается в массив строго на место текущего индекса Count</w:t>
+      </w:r>
+      <w:r>
+        <w:rPr>
+          <w:lang w:val="ru-RU"/>
+        </w:rPr>
+        <w:t>.</w:t>
+      </w:r>
+    </w:p>
+    <w:p>
+      <w:pPr>
+        <w:ind w:left="426"/>
+        <w:rPr>
+          <w:lang w:val="ru-RU"/>
+        </w:rPr>
+      </w:pPr>
+      <w:r>
+        <w:rPr>
+          <w:b/>
+          <w:bCs/>
+          <w:lang w:val="ru-RU"/>
+        </w:rPr>
+        <w:t xml:space="preserve">3) </w:t>
+      </w:r>
+      <w:r>
+        <w:rPr>
+          <w:b/>
+          <w:bCs/>
+        </w:rPr>
+        <w:t>Увеличение счетчика:</w:t>
+      </w:r>
+      <w:r>
+        <w:t xml:space="preserve"> </w:t>
+      </w:r>
+      <w:r>
+        <w:rPr>
+          <w:lang w:val="ru-RU"/>
+        </w:rPr>
+        <w:t>п</w:t>
+      </w:r>
+      <w:r>
+        <w:t xml:space="preserve">осле успешной записи </w:t>
+      </w:r>
+      <w:r>
+        <w:rPr>
+          <w:lang w:val="ru-RU"/>
+        </w:rPr>
+        <w:t>с</w:t>
+      </w:r>
+      <w:r>
+        <w:t>четчик</w:t>
+      </w:r>
+      <w:r>
+        <w:rPr>
+          <w:lang w:val="ru-RU"/>
+        </w:rPr>
+        <w:t xml:space="preserve"> увеличивается</w:t>
+      </w:r>
+      <w:r>
+        <w:t xml:space="preserve"> на единицу, фиксируя, что теперь элементов стало больше:</w:t>
+      </w:r>
+      <w:r>
+        <w:rPr>
+          <w:lang w:val="ru-RU"/>
+        </w:rPr>
+        <w:tab/>
+      </w:r>
+      <w:r>
+        <w:rPr>
+          <w:lang w:val="ru-RU"/>
+        </w:rPr>
+        <w:t>Count++;</w:t>
+      </w:r>
+    </w:p>
+    <w:p>
+      <w:pPr>
         <w:ind w:left="720"/>
         <w:rPr>
+          <w:lang w:val="ru-UA"/>
+        </w:rPr>
+      </w:pPr>
+    </w:p>
+    <w:p>
+      <w:pPr>
+        <w:ind w:left="284"/>
+        <w:rPr>
+          <w:b/>
+          <w:bCs/>
+          <w:lang w:val="ru-UA"/>
+        </w:rPr>
+      </w:pPr>
+      <w:r>
+        <w:rPr>
+          <w:b/>
+          <w:bCs/>
+          <w:lang w:val="ru-UA"/>
+        </w:rPr>
+        <w:t>Логика удаления со сдвигом элементов влево</w:t>
+      </w:r>
+      <w:r>
+        <w:rPr>
+          <w:b/>
+          <w:bCs/>
+          <w:lang w:val="ru-UA"/>
+        </w:rPr>
+        <w:t xml:space="preserve"> </w:t>
+      </w:r>
+      <w:r>
+        <w:rPr>
+          <w:b/>
+          <w:bCs/>
+        </w:rPr>
+        <w:t>(DeleteOrder)</w:t>
+      </w:r>
+      <w:r>
+        <w:rPr>
+          <w:b/>
+          <w:bCs/>
+          <w:lang w:val="ru-UA"/>
+        </w:rPr>
+        <w:t>:</w:t>
+      </w:r>
+    </w:p>
+    <w:p>
+      <w:pPr>
+        <w:ind w:left="709"/>
+        <w:rPr>
           <w:lang w:val="ru-RU"/>
         </w:rPr>
       </w:pPr>
       <w:r>
-        <w:t>Когда пользователь нажимает кнопку «Сохранить» в диалоговом окне WPF, вызывается метод добавления из проекта Core.</w:t>
-      </w:r>
-    </w:p>
-    <w:p>
-      <w:pPr>
-        <w:ind w:left="720"/>
-        <w:rPr>
+        <w:rPr>
+          <w:b/>
+          <w:bCs/>
           <w:lang w:val="ru-RU"/>
         </w:rPr>
-      </w:pPr>
-    </w:p>
-    <w:p>
-      <w:pPr>
-        <w:ind w:left="720"/>
+        <w:t xml:space="preserve">1) </w:t>
+      </w:r>
+      <w:r>
+        <w:rPr>
+          <w:b/>
+          <w:bCs/>
+        </w:rPr>
+        <w:t>Проверка индекса:</w:t>
+      </w:r>
+      <w:r>
+        <w:t xml:space="preserve"> Метод убеждается, что удаляемый индекс существует и находится в пределах от 0 до Count - 1.</w:t>
+      </w:r>
+    </w:p>
+    <w:p>
+      <w:pPr>
+        <w:ind w:left="709"/>
         <w:rPr>
           <w:lang w:val="ru-RU"/>
         </w:rPr>
@@ -2836,351 +3111,7 @@
           <w:bCs/>
           <w:lang w:val="ru-RU"/>
         </w:rPr>
-        <w:t xml:space="preserve">1) </w:t>
-      </w:r>
-      <w:r>
-        <w:rPr>
-          <w:b/>
-          <w:bCs/>
-        </w:rPr>
-        <w:t>Проверка вместимости:</w:t>
-      </w:r>
-      <w:r>
-        <w:t xml:space="preserve"> </w:t>
-      </w:r>
-      <w:r>
-        <w:rPr>
-          <w:lang w:val="ru-RU"/>
-        </w:rPr>
-        <w:t>с</w:t>
-      </w:r>
-      <w:r>
-        <w:t>начала метод проверяет, не заполнился ли массив до отказа:</w:t>
-      </w:r>
-    </w:p>
-    <w:p>
-      <w:pPr>
-        <w:ind w:left="1276"/>
-        <w:rPr>
-          <w:lang w:val="en-US"/>
-        </w:rPr>
-      </w:pPr>
-      <w:r>
-        <w:rPr>
-          <w:lang w:val="en-US"/>
-        </w:rPr>
-        <w:t xml:space="preserve">if (Count &gt;= _orders.Length) // </w:t>
-      </w:r>
-      <w:r>
-        <w:rPr>
-          <w:lang w:val="ru-RU"/>
-        </w:rPr>
-        <w:t>Если</w:t>
-      </w:r>
-      <w:r>
-        <w:rPr>
-          <w:lang w:val="en-US"/>
-        </w:rPr>
-        <w:t xml:space="preserve"> Count </w:t>
-      </w:r>
-      <w:r>
-        <w:rPr>
-          <w:lang w:val="ru-RU"/>
-        </w:rPr>
-        <w:t>равен</w:t>
-      </w:r>
-      <w:r>
-        <w:rPr>
-          <w:lang w:val="en-US"/>
-        </w:rPr>
-        <w:t xml:space="preserve"> 100</w:t>
-      </w:r>
-    </w:p>
-    <w:p>
-      <w:pPr>
-        <w:ind w:left="1276"/>
-        <w:rPr>
-          <w:lang w:val="en-US"/>
-        </w:rPr>
-      </w:pPr>
-      <w:r>
-        <w:rPr>
-          <w:lang w:val="en-US"/>
-        </w:rPr>
-        <w:t>{</w:t>
-      </w:r>
-    </w:p>
-    <w:p>
-      <w:pPr>
-        <w:ind w:left="1276"/>
-        <w:rPr>
-          <w:lang w:val="en-US"/>
-        </w:rPr>
-      </w:pPr>
-      <w:r>
-        <w:rPr>
-          <w:lang w:val="en-US"/>
-        </w:rPr>
-        <w:t xml:space="preserve">    throw new InvalidOperationException("Array is full");</w:t>
-      </w:r>
-    </w:p>
-    <w:p>
-      <w:pPr>
-        <w:ind w:left="1276"/>
-        <w:rPr>
-          <w:lang w:val="ru-RU"/>
-        </w:rPr>
-      </w:pPr>
-      <w:r>
-        <w:rPr>
-          <w:lang w:val="ru-RU"/>
-        </w:rPr>
-        <w:t>}</w:t>
-      </w:r>
-    </w:p>
-    <w:p>
-      <w:pPr>
-        <w:ind w:left="720"/>
-        <w:rPr>
-          <w:lang w:val="ru-RU"/>
-        </w:rPr>
-      </w:pPr>
-      <w:r>
-        <w:rPr>
-          <w:b/>
-          <w:bCs/>
-          <w:lang w:val="ru-RU"/>
-        </w:rPr>
-        <w:t xml:space="preserve">2) </w:t>
-      </w:r>
-      <w:r>
-        <w:rPr>
-          <w:b/>
-          <w:bCs/>
-        </w:rPr>
-        <w:t>Запись в ячейку:</w:t>
-      </w:r>
-      <w:r>
-        <w:t xml:space="preserve"> </w:t>
-      </w:r>
-      <w:r>
-        <w:rPr>
-          <w:lang w:val="ru-RU"/>
-        </w:rPr>
-        <w:t>е</w:t>
-      </w:r>
-      <w:r>
-        <w:t>сли место есть, новый заказ помещается в массив строго на место текущего индекса Count:</w:t>
-      </w:r>
-      <w:r>
-        <w:rPr>
-          <w:lang w:val="ru-RU"/>
-        </w:rPr>
-        <w:tab/>
-      </w:r>
-      <w:r>
-        <w:rPr>
-          <w:lang w:val="ru-RU"/>
-        </w:rPr>
-        <w:tab/>
-      </w:r>
-      <w:r>
-        <w:rPr>
-          <w:lang w:val="ru-RU"/>
-        </w:rPr>
-        <w:tab/>
-      </w:r>
-      <w:r>
-        <w:rPr>
-          <w:lang w:val="ru-RU"/>
-        </w:rPr>
-        <w:tab/>
-      </w:r>
-      <w:r>
-        <w:rPr>
-          <w:lang w:val="ru-RU"/>
-        </w:rPr>
-        <w:t>_orders[Count] = newOrder;</w:t>
-      </w:r>
-    </w:p>
-    <w:p>
-      <w:pPr>
-        <w:ind w:left="720"/>
-        <w:rPr>
-          <w:lang w:val="ru-RU"/>
-        </w:rPr>
-      </w:pPr>
-      <w:r>
-        <w:rPr>
-          <w:b/>
-          <w:bCs/>
-          <w:lang w:val="ru-RU"/>
-        </w:rPr>
-        <w:t xml:space="preserve">3) </w:t>
-      </w:r>
-      <w:r>
-        <w:rPr>
-          <w:b/>
-          <w:bCs/>
-        </w:rPr>
-        <w:t>Увеличение счетчика:</w:t>
-      </w:r>
-      <w:r>
-        <w:t xml:space="preserve"> </w:t>
-      </w:r>
-      <w:r>
-        <w:rPr>
-          <w:lang w:val="ru-RU"/>
-        </w:rPr>
-        <w:t>п</w:t>
-      </w:r>
-      <w:r>
-        <w:t xml:space="preserve">осле успешной записи </w:t>
-      </w:r>
-      <w:r>
-        <w:rPr>
-          <w:lang w:val="ru-RU"/>
-        </w:rPr>
-        <w:t>с</w:t>
-      </w:r>
-      <w:r>
-        <w:t>четчик</w:t>
-      </w:r>
-      <w:r>
-        <w:rPr>
-          <w:lang w:val="ru-RU"/>
-        </w:rPr>
-        <w:t xml:space="preserve"> увеличивается</w:t>
-      </w:r>
-      <w:r>
-        <w:t xml:space="preserve"> на единицу, фиксируя, что теперь элементов стало больше:</w:t>
-      </w:r>
-      <w:r>
-        <w:rPr>
-          <w:lang w:val="ru-RU"/>
-        </w:rPr>
-        <w:tab/>
-      </w:r>
-      <w:r>
-        <w:rPr>
-          <w:lang w:val="ru-RU"/>
-        </w:rPr>
-        <w:t>Count++;</w:t>
-      </w:r>
-    </w:p>
-    <w:p>
-      <w:pPr>
-        <w:ind w:left="720"/>
-        <w:rPr>
-          <w:lang w:val="ru-UA"/>
-        </w:rPr>
-      </w:pPr>
-    </w:p>
-    <w:p>
-      <w:pPr>
-        <w:ind w:left="720"/>
-        <w:rPr>
-          <w:lang w:val="ru-UA"/>
-        </w:rPr>
-      </w:pPr>
-    </w:p>
-    <w:p>
-      <w:pPr>
-        <w:ind w:left="720"/>
-        <w:rPr>
-          <w:lang w:val="ru-UA"/>
-        </w:rPr>
-      </w:pPr>
-    </w:p>
-    <w:p>
-      <w:pPr>
-        <w:ind w:left="284"/>
-        <w:rPr>
-          <w:b/>
-          <w:bCs/>
-          <w:lang w:val="ru-UA"/>
-        </w:rPr>
-      </w:pPr>
-      <w:r>
-        <w:rPr>
-          <w:b/>
-          <w:bCs/>
-          <w:lang w:val="ru-UA"/>
-        </w:rPr>
         <w:lastRenderedPageBreak/>
-        <w:t>Логика удаления со сдвигом элементов влево</w:t>
-      </w:r>
-      <w:r>
-        <w:rPr>
-          <w:b/>
-          <w:bCs/>
-          <w:lang w:val="ru-UA"/>
-        </w:rPr>
-        <w:t xml:space="preserve"> </w:t>
-      </w:r>
-      <w:r>
-        <w:rPr>
-          <w:b/>
-          <w:bCs/>
-        </w:rPr>
-        <w:t>(DeleteOrder)</w:t>
-      </w:r>
-      <w:r>
-        <w:rPr>
-          <w:b/>
-          <w:bCs/>
-          <w:lang w:val="ru-UA"/>
-        </w:rPr>
-        <w:t>:</w:t>
-      </w:r>
-    </w:p>
-    <w:p>
-      <w:pPr>
-        <w:ind w:left="709"/>
-        <w:rPr>
-          <w:lang w:val="ru-RU"/>
-        </w:rPr>
-      </w:pPr>
-      <w:r>
-        <w:rPr>
-          <w:b/>
-          <w:bCs/>
-          <w:lang w:val="ru-RU"/>
-        </w:rPr>
-        <w:t xml:space="preserve">1) </w:t>
-      </w:r>
-      <w:r>
-        <w:rPr>
-          <w:b/>
-          <w:bCs/>
-        </w:rPr>
-        <w:t>Проверка индекса:</w:t>
-      </w:r>
-      <w:r>
-        <w:t xml:space="preserve"> Метод убеждается, что удаляемый индекс существует и находится в пределах от 0 до Count - 1.</w:t>
-      </w:r>
-    </w:p>
-    <w:p>
-      <w:pPr>
-        <w:ind w:left="709"/>
-        <w:rPr>
-          <w:lang w:val="ru-RU"/>
-        </w:rPr>
-      </w:pPr>
-    </w:p>
-    <w:p>
-      <w:pPr>
-        <w:ind w:left="709"/>
-        <w:rPr>
-          <w:lang w:val="ru-RU"/>
-        </w:rPr>
-      </w:pPr>
-      <w:r>
-        <w:rPr>
-          <w:b/>
-          <w:bCs/>
-          <w:lang w:val="ru-RU"/>
-        </w:rPr>
         <w:t xml:space="preserve">2) </w:t>
       </w:r>
       <w:r>
@@ -3224,313 +3155,93 @@
     </w:p>
     <w:p>
       <w:pPr>
-        <w:ind w:left="1276"/>
+        <w:ind w:left="709"/>
         <w:rPr>
           <w:lang w:val="ru-RU"/>
         </w:rPr>
       </w:pPr>
       <w:r>
         <w:rPr>
-          <w:lang w:val="en-US"/>
-        </w:rPr>
-        <w:t>for</w:t>
-      </w:r>
-      <w:r>
-        <w:rPr>
+          <w:b/>
+          <w:bCs/>
           <w:lang w:val="ru-RU"/>
         </w:rPr>
-        <w:t xml:space="preserve"> (</w:t>
-      </w:r>
-      <w:r>
-        <w:rPr>
-          <w:lang w:val="en-US"/>
-        </w:rPr>
-        <w:t>int</w:t>
+        <w:t xml:space="preserve">3) </w:t>
+      </w:r>
+      <w:r>
+        <w:rPr>
+          <w:b/>
+          <w:bCs/>
+        </w:rPr>
+        <w:t>Очистка хвоста и уменьшение счетчика:</w:t>
+      </w:r>
+      <w:r>
+        <w:t xml:space="preserve"> </w:t>
       </w:r>
       <w:r>
         <w:rPr>
           <w:lang w:val="ru-RU"/>
         </w:rPr>
-        <w:t xml:space="preserve"> </w:t>
-      </w:r>
-      <w:r>
-        <w:rPr>
-          <w:lang w:val="en-US"/>
-        </w:rPr>
-        <w:t>i</w:t>
-      </w:r>
-      <w:r>
+        <w:t>п</w:t>
+      </w:r>
+      <w:r>
+        <w:t>осле того как все элементы сдвинулись влево, самый последний заполненный элемент (который теперь дублируется) нужно стереть, а счетчик уменьшить на 1:</w:t>
+      </w:r>
+    </w:p>
+    <w:p>
+      <w:pPr>
         <w:rPr>
           <w:lang w:val="ru-RU"/>
         </w:rPr>
-        <w:t xml:space="preserve"> = </w:t>
-      </w:r>
-      <w:r>
-        <w:rPr>
-          <w:lang w:val="en-US"/>
-        </w:rPr>
-        <w:t>index</w:t>
-      </w:r>
-      <w:r>
+      </w:pPr>
+    </w:p>
+    <w:p>
+      <w:pPr>
         <w:rPr>
           <w:lang w:val="ru-RU"/>
         </w:rPr>
-        <w:t xml:space="preserve">; </w:t>
-      </w:r>
-      <w:r>
-        <w:rPr>
-          <w:lang w:val="en-US"/>
-        </w:rPr>
-        <w:t>i</w:t>
-      </w:r>
+      </w:pPr>
       <w:r>
         <w:rPr>
           <w:lang w:val="ru-RU"/>
         </w:rPr>
-        <w:t xml:space="preserve"> &lt; </w:t>
-      </w:r>
-      <w:r>
-        <w:rPr>
-          <w:lang w:val="en-US"/>
-        </w:rPr>
-        <w:t>Count</w:t>
+        <w:t>======================================================================</w:t>
       </w:r>
       <w:r>
         <w:rPr>
           <w:lang w:val="ru-RU"/>
         </w:rPr>
-        <w:t xml:space="preserve"> - 1; </w:t>
-      </w:r>
-      <w:r>
-        <w:rPr>
-          <w:lang w:val="en-US"/>
-        </w:rPr>
-        <w:t>i</w:t>
-      </w:r>
-      <w:r>
+        <w:t>=================</w:t>
+      </w:r>
+    </w:p>
+    <w:p>
+      <w:pPr>
         <w:rPr>
           <w:lang w:val="ru-RU"/>
         </w:rPr>
-        <w:t>++)</w:t>
-      </w:r>
-    </w:p>
-    <w:p>
-      <w:pPr>
-        <w:ind w:left="1276"/>
-        <w:rPr>
+      </w:pPr>
+    </w:p>
+    <w:p>
+      <w:pPr>
+        <w:rPr>
+          <w:b/>
+          <w:bCs/>
           <w:lang w:val="ru-RU"/>
         </w:rPr>
       </w:pPr>
       <w:r>
         <w:rPr>
+          <w:b/>
+          <w:bCs/>
+        </w:rPr>
+        <w:t>WPF и использование (Интерфейс, диалоги и фильтрация)</w:t>
+      </w:r>
+    </w:p>
+    <w:p>
+      <w:pPr>
+        <w:rPr>
           <w:lang w:val="ru-RU"/>
         </w:rPr>
-        <w:t>{</w:t>
-      </w:r>
-    </w:p>
-    <w:p>
-      <w:pPr>
-        <w:ind w:left="1276"/>
-        <w:rPr>
-          <w:lang w:val="ru-UA"/>
-        </w:rPr>
-      </w:pPr>
-      <w:r>
-        <w:rPr>
-          <w:lang w:val="ru-RU"/>
-        </w:rPr>
-        <w:t xml:space="preserve">   // н</w:t>
-      </w:r>
-      <w:r>
-        <w:rPr>
-          <w:lang w:val="ru-UA"/>
-        </w:rPr>
-        <w:t>а место удаленного элемента _orders[1] записывается то, что было справа: _orders[2]</w:t>
-      </w:r>
-      <w:r>
-        <w:rPr>
-          <w:lang w:val="ru-UA"/>
-        </w:rPr>
-        <w:t xml:space="preserve"> и т. д.</w:t>
-      </w:r>
-    </w:p>
-    <w:p>
-      <w:pPr>
-        <w:ind w:left="1276"/>
-        <w:rPr>
-          <w:lang w:val="ru-UA"/>
-        </w:rPr>
-      </w:pPr>
-      <w:r>
-        <w:rPr>
-          <w:lang w:val="ru-RU"/>
-        </w:rPr>
-        <w:t xml:space="preserve">   _orders[i] = _orders[i + 1];</w:t>
-      </w:r>
-      <w:r>
-        <w:rPr>
-          <w:lang w:val="ru-RU"/>
-        </w:rPr>
-        <w:t xml:space="preserve"> </w:t>
-      </w:r>
-    </w:p>
-    <w:p>
-      <w:pPr>
-        <w:ind w:left="1276"/>
-        <w:rPr>
-          <w:lang w:val="ru-RU"/>
-        </w:rPr>
-      </w:pPr>
-      <w:r>
-        <w:rPr>
-          <w:lang w:val="ru-RU"/>
-        </w:rPr>
-        <w:t>}</w:t>
-      </w:r>
-    </w:p>
-    <w:p>
-      <w:pPr>
-        <w:ind w:left="1276"/>
-        <w:rPr>
-          <w:lang w:val="ru-RU"/>
-        </w:rPr>
-      </w:pPr>
-    </w:p>
-    <w:p>
-      <w:pPr>
-        <w:ind w:left="709"/>
-        <w:rPr>
-          <w:lang w:val="ru-RU"/>
-        </w:rPr>
-      </w:pPr>
-      <w:r>
-        <w:rPr>
-          <w:b/>
-          <w:bCs/>
-          <w:lang w:val="ru-RU"/>
-        </w:rPr>
-        <w:t xml:space="preserve">3) </w:t>
-      </w:r>
-      <w:r>
-        <w:rPr>
-          <w:b/>
-          <w:bCs/>
-        </w:rPr>
-        <w:t>Очистка хвоста и уменьшение счетчика:</w:t>
-      </w:r>
-      <w:r>
-        <w:t xml:space="preserve"> </w:t>
-      </w:r>
-      <w:r>
-        <w:rPr>
-          <w:lang w:val="ru-RU"/>
-        </w:rPr>
-        <w:t>п</w:t>
-      </w:r>
-      <w:r>
-        <w:t>осле того как все элементы сдвинулись влево, самый последний заполненный элемент (который теперь дублируется) нужно стереть, а счетчик уменьшить на 1:</w:t>
-      </w:r>
-    </w:p>
-    <w:p>
-      <w:pPr>
-        <w:ind w:left="1276"/>
-        <w:rPr>
-          <w:lang w:val="ru-RU"/>
-        </w:rPr>
-      </w:pPr>
-      <w:r>
-        <w:rPr>
-          <w:lang w:val="ru-RU"/>
-        </w:rPr>
-        <w:t>_orders[Count - 1] = default; // Очищаем последнюю ячейку (сбрасываем структуру)</w:t>
-      </w:r>
-    </w:p>
-    <w:p>
-      <w:pPr>
-        <w:ind w:left="1276"/>
-        <w:rPr>
-          <w:lang w:val="ru-RU"/>
-        </w:rPr>
-      </w:pPr>
-      <w:r>
-        <w:rPr>
-          <w:lang w:val="ru-RU"/>
-        </w:rPr>
-        <w:t>Count--; // Теперь Count стал равен 4</w:t>
-      </w:r>
-    </w:p>
-    <w:p>
-      <w:pPr>
-        <w:rPr>
-          <w:lang w:val="ru-RU"/>
-        </w:rPr>
-      </w:pPr>
-    </w:p>
-    <w:p>
-      <w:pPr>
-        <w:ind w:left="709"/>
-        <w:rPr>
-          <w:lang w:val="ru-RU"/>
-        </w:rPr>
-      </w:pPr>
-      <w:r>
-        <w:t>Это гарантирует, что в массиве не будет пустых «дыр», а первые Count элементов всегда будут актуальным непрерывным списком.</w:t>
-      </w:r>
-    </w:p>
-    <w:p>
-      <w:pPr>
-        <w:rPr>
-          <w:lang w:val="ru-RU"/>
-        </w:rPr>
-      </w:pPr>
-    </w:p>
-    <w:p>
-      <w:pPr>
-        <w:rPr>
-          <w:lang w:val="ru-RU"/>
-        </w:rPr>
-      </w:pPr>
-      <w:r>
-        <w:rPr>
-          <w:lang w:val="ru-RU"/>
-        </w:rPr>
-        <w:t>======================================================================</w:t>
-      </w:r>
-      <w:r>
-        <w:rPr>
-          <w:lang w:val="ru-RU"/>
-        </w:rPr>
-        <w:t>=================</w:t>
-      </w:r>
-    </w:p>
-    <w:p>
-      <w:pPr>
-        <w:rPr>
-          <w:lang w:val="ru-RU"/>
-        </w:rPr>
-      </w:pPr>
-    </w:p>
-    <w:p>
-      <w:pPr>
-        <w:rPr>
-          <w:b/>
-          <w:bCs/>
-          <w:lang w:val="ru-RU"/>
-        </w:rPr>
-      </w:pPr>
-      <w:r>
-        <w:rPr>
-          <w:b/>
-          <w:bCs/>
-        </w:rPr>
-        <w:t>WPF и использование (Интерфейс, диалоги и фильтрация)</w:t>
-      </w:r>
-    </w:p>
-    <w:p>
-      <w:pPr>
-        <w:rPr>
-          <w:lang w:val="ru-RU"/>
-        </w:rPr>
       </w:pPr>
     </w:p>
     <w:p>
@@ -3552,52 +3263,36 @@
     </w:p>
     <w:p>
       <w:pPr>
-        <w:numPr>
-          <w:ilvl w:val="0"/>
-          <w:numId w:val="21"/>
-        </w:numPr>
-        <w:rPr>
-          <w:lang w:val="ru-UA"/>
-        </w:rPr>
-      </w:pPr>
-      <w:r>
-        <w:rPr>
-          <w:b/>
-          <w:bCs/>
-          <w:lang w:val="ru-UA"/>
-        </w:rPr>
-        <w:t>Как реализовано:</w:t>
-      </w:r>
-      <w:r>
-        <w:rPr>
-          <w:lang w:val="ru-UA"/>
-        </w:rPr>
-        <w:t xml:space="preserve"> Главное окно (MainWindow.xaml) содержит компонент &lt;DataGrid&gt;, источник данных которого (ItemsSource) привязывается не ко всему массиву на 100 элементов, а только к его актуальной части.</w:t>
-      </w:r>
-    </w:p>
-    <w:p>
-      <w:pPr>
-        <w:numPr>
-          <w:ilvl w:val="0"/>
-          <w:numId w:val="21"/>
-        </w:numPr>
-        <w:rPr>
-          <w:lang w:val="ru-UA"/>
-        </w:rPr>
-      </w:pPr>
-      <w:r>
-        <w:rPr>
-          <w:b/>
-          <w:bCs/>
-          <w:lang w:val="ru-UA"/>
-        </w:rPr>
-        <w:t>Технический подход:</w:t>
-      </w:r>
-      <w:r>
-        <w:rPr>
-          <w:lang w:val="ru-UA"/>
-        </w:rPr>
-        <w:t xml:space="preserve"> Для этого используется метод выборки из Core, который возвращает срез массива от индекса 0 до Count - 1 (например, через LINQ-метод .Take(Count) или вспомогательный метод обхода массива).</w:t>
+        <w:ind w:left="360"/>
+        <w:rPr>
+          <w:lang w:val="ru-UA"/>
+        </w:rPr>
+      </w:pPr>
+      <w:r>
+        <w:rPr>
+          <w:lang w:val="ru-UA"/>
+        </w:rPr>
+        <w:t>Главное окно (MainWindow.xaml) содержит компонент &lt;DataGrid&gt;, источник данных которого (ItemsSource) привязывается не ко всему массиву на 100 элементов, а только к его актуальной части.</w:t>
+      </w:r>
+    </w:p>
+    <w:p>
+      <w:pPr>
+        <w:ind w:left="360"/>
+        <w:rPr>
+          <w:lang w:val="ru-UA"/>
+        </w:rPr>
+      </w:pPr>
+      <w:r>
+        <w:rPr>
+          <w:lang w:val="ru-UA"/>
+        </w:rPr>
+        <w:t>Д</w:t>
+      </w:r>
+      <w:r>
+        <w:rPr>
+          <w:lang w:val="ru-UA"/>
+        </w:rPr>
+        <w:t>ля этого используется метод выборки из Core, который возвращает срез массива от индекса 0 до Count - 1 (через LINQ-метод .Take(Count)).</w:t>
       </w:r>
     </w:p>
     <w:p>
@@ -3627,11 +3322,7 @@
     <w:p>
       <w:pPr>
         <w:pStyle w:val="a9"/>
-        <w:numPr>
-          <w:ilvl w:val="0"/>
-          <w:numId w:val="28"/>
-        </w:numPr>
-        <w:ind w:left="709" w:hanging="283"/>
+        <w:ind w:left="284"/>
         <w:rPr>
           <w:lang w:val="ru-UA"/>
         </w:rPr>
@@ -3660,11 +3351,7 @@
     <w:p>
       <w:pPr>
         <w:pStyle w:val="a9"/>
-        <w:numPr>
-          <w:ilvl w:val="0"/>
-          <w:numId w:val="28"/>
-        </w:numPr>
-        <w:ind w:left="709" w:hanging="283"/>
+        <w:ind w:left="284"/>
         <w:rPr>
           <w:lang w:val="ru-UA"/>
         </w:rPr>
@@ -3692,53 +3379,6 @@
     </w:p>
     <w:p>
       <w:pPr>
-        <w:pStyle w:val="a9"/>
-        <w:numPr>
-          <w:ilvl w:val="0"/>
-          <w:numId w:val="28"/>
-        </w:numPr>
-        <w:ind w:left="709" w:hanging="283"/>
-        <w:rPr>
-          <w:lang w:val="ru-UA"/>
-        </w:rPr>
-      </w:pPr>
-      <w:r>
-        <w:rPr>
-          <w:lang w:val="ru-UA"/>
-        </w:rPr>
-        <w:t xml:space="preserve">При нажатии кнопки </w:t>
-      </w:r>
-      <w:r>
-        <w:rPr>
-          <w:b/>
-          <w:bCs/>
-          <w:lang w:val="ru-UA"/>
-        </w:rPr>
-        <w:t>«Изменить»</w:t>
-      </w:r>
-      <w:r>
-        <w:rPr>
-          <w:lang w:val="ru-UA"/>
-        </w:rPr>
-        <w:t xml:space="preserve"> окно открывается в режиме редактирования, предварительно заполняясь данными выбранной в </w:t>
-      </w:r>
-      <w:r>
-        <w:rPr>
-          <w:b/>
-          <w:bCs/>
-          <w:lang w:val="ru-UA"/>
-        </w:rPr>
-        <w:t>DataGrid</w:t>
-      </w:r>
-      <w:r>
-        <w:rPr>
-          <w:lang w:val="ru-UA"/>
-        </w:rPr>
-        <w:t xml:space="preserve"> строки.</w:t>
-      </w:r>
-    </w:p>
-    <w:p>
-      <w:pPr>
         <w:rPr>
           <w:lang w:val="ru-UA"/>
         </w:rPr>
@@ -3763,172 +3403,22 @@
     </w:p>
     <w:p>
       <w:pPr>
-        <w:numPr>
-          <w:ilvl w:val="0"/>
-          <w:numId w:val="23"/>
-        </w:numPr>
-        <w:rPr>
-          <w:lang w:val="ru-UA"/>
-        </w:rPr>
-      </w:pPr>
-      <w:r>
-        <w:rPr>
-          <w:b/>
-          <w:bCs/>
-          <w:lang w:val="ru-UA"/>
-        </w:rPr>
-        <w:t>Как реализовано:</w:t>
-      </w:r>
-      <w:r>
-        <w:rPr>
-          <w:lang w:val="ru-UA"/>
-        </w:rPr>
-        <w:t xml:space="preserve"> Перед тем как вызвать метод удаления из проекта Core, приложение WPF запрашивает у пользователя подтверждение действия.</w:t>
-      </w:r>
-    </w:p>
-    <w:p>
-      <w:pPr>
-        <w:numPr>
-          <w:ilvl w:val="0"/>
-          <w:numId w:val="23"/>
-        </w:numPr>
-        <w:rPr>
-          <w:lang w:val="ru-UA"/>
-        </w:rPr>
-      </w:pPr>
-      <w:r>
-        <w:rPr>
-          <w:b/>
-          <w:bCs/>
-          <w:lang w:val="ru-UA"/>
-        </w:rPr>
-        <w:t>Пример кода в WPF:</w:t>
-      </w:r>
-    </w:p>
-    <w:p>
-      <w:pPr>
-        <w:ind w:left="1134"/>
-        <w:rPr>
-          <w:lang w:val="ru-UA"/>
-        </w:rPr>
-      </w:pPr>
-      <w:r>
-        <w:rPr>
-          <w:lang w:val="ru-UA"/>
-        </w:rPr>
-        <w:t>MessageBoxResult result = MessageBox.Show(</w:t>
-      </w:r>
-    </w:p>
-    <w:p>
-      <w:pPr>
-        <w:ind w:left="1134"/>
-        <w:rPr>
-          <w:lang w:val="ru-UA"/>
-        </w:rPr>
-      </w:pPr>
-      <w:r>
-        <w:rPr>
-          <w:lang w:val="ru-UA"/>
-        </w:rPr>
-        <w:t xml:space="preserve">    Properties.Resources.ConfirmDeleteText, // Текст из ресурсов</w:t>
-      </w:r>
-    </w:p>
-    <w:p>
-      <w:pPr>
-        <w:ind w:left="1134"/>
-        <w:rPr>
-          <w:lang w:val="ru-UA"/>
-        </w:rPr>
-      </w:pPr>
-      <w:r>
-        <w:rPr>
-          <w:lang w:val="ru-UA"/>
-        </w:rPr>
-        <w:t xml:space="preserve">    Properties.Resources.ConfirmDeleteTitle, // Заголовок из ресурсов</w:t>
-      </w:r>
-    </w:p>
-    <w:p>
-      <w:pPr>
-        <w:ind w:left="1134"/>
-        <w:rPr>
-          <w:lang w:val="ru-UA"/>
-        </w:rPr>
-      </w:pPr>
-      <w:r>
-        <w:rPr>
-          <w:lang w:val="ru-UA"/>
-        </w:rPr>
-        <w:t xml:space="preserve">    MessageBoxButton.YesNo, </w:t>
-      </w:r>
-    </w:p>
-    <w:p>
-      <w:pPr>
-        <w:ind w:left="1134"/>
-        <w:rPr>
-          <w:lang w:val="ru-UA"/>
-        </w:rPr>
-      </w:pPr>
-      <w:r>
-        <w:rPr>
-          <w:lang w:val="ru-UA"/>
-        </w:rPr>
-        <w:t xml:space="preserve">    MessageBoxImage.Warning);</w:t>
-      </w:r>
-    </w:p>
-    <w:p>
-      <w:pPr>
-        <w:ind w:left="1134"/>
-        <w:rPr>
-          <w:lang w:val="ru-UA"/>
-        </w:rPr>
-      </w:pPr>
-      <w:r>
-        <w:rPr>
-          <w:lang w:val="ru-UA"/>
-        </w:rPr>
-        <w:t>if (result == MessageBoxResult.Yes)</w:t>
-      </w:r>
-    </w:p>
-    <w:p>
-      <w:pPr>
-        <w:ind w:left="1134"/>
-        <w:rPr>
-          <w:lang w:val="ru-UA"/>
-        </w:rPr>
-      </w:pPr>
-      <w:r>
-        <w:rPr>
-          <w:lang w:val="ru-UA"/>
-        </w:rPr>
-        <w:t>{</w:t>
-      </w:r>
-    </w:p>
-    <w:p>
-      <w:pPr>
-        <w:ind w:left="1134"/>
-        <w:rPr>
-          <w:lang w:val="ru-UA"/>
-        </w:rPr>
-      </w:pPr>
-      <w:r>
-        <w:rPr>
-          <w:lang w:val="ru-UA"/>
-        </w:rPr>
-        <w:t xml:space="preserve">    // Вызов метода удаления из Core и обновление DataGrid</w:t>
-      </w:r>
-    </w:p>
-    <w:p>
-      <w:pPr>
-        <w:ind w:left="1134"/>
-        <w:rPr>
-          <w:lang w:val="ru-UA"/>
-        </w:rPr>
-      </w:pPr>
-      <w:r>
-        <w:rPr>
-          <w:lang w:val="ru-UA"/>
-        </w:rPr>
-        <w:t>}</w:t>
+        <w:ind w:left="284"/>
+        <w:rPr>
+          <w:lang w:val="ru-UA"/>
+        </w:rPr>
+      </w:pPr>
+      <w:r>
+        <w:rPr>
+          <w:lang w:val="ru-UA"/>
+        </w:rPr>
+        <w:t>П</w:t>
+      </w:r>
+      <w:r>
+        <w:rPr>
+          <w:lang w:val="ru-UA"/>
+        </w:rPr>
+        <w:t>еред тем как вызвать метод удаления из проекта Core, приложение WPF запрашивает у пользователя подтверждение действия.</w:t>
       </w:r>
     </w:p>
     <w:p>
@@ -3967,17 +3457,21 @@
       </w:pPr>
       <w:r>
         <w:rPr>
-          <w:b/>
-          <w:bCs/>
-          <w:lang w:val="ru-UA"/>
-        </w:rPr>
-        <w:t>Как реализовано:</w:t>
-      </w:r>
-      <w:r>
-        <w:rPr>
-          <w:lang w:val="ru-UA"/>
-        </w:rPr>
-        <w:t xml:space="preserve"> В интерфейсе добавлено поле ввода (строка поиска) и кнопка фильтрации по имени клиента или размеру пиццы.</w:t>
+          <w:lang w:val="ru-UA"/>
+        </w:rPr>
+        <w:t>В интерфейсе добавлено поле ввода (строка поиска)</w:t>
+      </w:r>
+      <w:r>
+        <w:rPr>
+          <w:lang w:val="ru-UA"/>
+        </w:rPr>
+        <w:t xml:space="preserve"> – только по имени</w:t>
+      </w:r>
+      <w:r>
+        <w:rPr>
+          <w:lang w:val="ru-UA"/>
+        </w:rPr>
+        <w:t>.</w:t>
       </w:r>
     </w:p>
     <w:p>
@@ -3996,148 +3490,63 @@
           <w:bCs/>
           <w:lang w:val="ru-UA"/>
         </w:rPr>
-        <w:lastRenderedPageBreak/>
         <w:t>Алгоритм обхода через цикл:</w:t>
       </w:r>
       <w:r>
         <w:rPr>
           <w:lang w:val="ru-UA"/>
         </w:rPr>
-        <w:t xml:space="preserve"> Для поиска не используются скрытые базы данных — поиск выполняется путем прямого перебора элементов массива в цикле for от 0 до Count - 1:</w:t>
-      </w:r>
-    </w:p>
-    <w:p>
-      <w:pPr>
-        <w:ind w:left="1134"/>
-        <w:rPr>
-          <w:lang w:val="ru-UA"/>
-        </w:rPr>
-      </w:pPr>
-      <w:r>
-        <w:rPr>
-          <w:lang w:val="ru-UA"/>
-        </w:rPr>
-        <w:t>List&lt;PizzaOrder&gt; filteredList = new List&lt;PizzaOrder&gt;();</w:t>
-      </w:r>
-    </w:p>
-    <w:p>
-      <w:pPr>
-        <w:ind w:left="1134"/>
-        <w:rPr>
-          <w:lang w:val="ru-UA"/>
-        </w:rPr>
-      </w:pPr>
-      <w:r>
-        <w:rPr>
-          <w:lang w:val="ru-UA"/>
-        </w:rPr>
-        <w:t>for (int i = 0; i &lt; PizzaManager.Count; i++)</w:t>
-      </w:r>
-    </w:p>
-    <w:p>
-      <w:pPr>
-        <w:ind w:left="1134"/>
-        <w:rPr>
-          <w:lang w:val="ru-UA"/>
-        </w:rPr>
-      </w:pPr>
-      <w:r>
-        <w:rPr>
-          <w:lang w:val="ru-UA"/>
-        </w:rPr>
-        <w:t>{</w:t>
-      </w:r>
-    </w:p>
-    <w:p>
-      <w:pPr>
-        <w:ind w:left="1134"/>
-        <w:rPr>
-          <w:lang w:val="ru-UA"/>
-        </w:rPr>
-      </w:pPr>
-      <w:r>
-        <w:rPr>
-          <w:lang w:val="ru-UA"/>
-        </w:rPr>
-        <w:t xml:space="preserve">    if (PizzaManager.Orders[i].ClientName.Contains(searchQuery, StringComparison.OrdinalIgnoreCase))</w:t>
-      </w:r>
-    </w:p>
-    <w:p>
-      <w:pPr>
-        <w:ind w:left="1134"/>
-        <w:rPr>
-          <w:lang w:val="ru-UA"/>
-        </w:rPr>
-      </w:pPr>
-      <w:r>
-        <w:rPr>
-          <w:lang w:val="ru-UA"/>
-        </w:rPr>
-        <w:t xml:space="preserve">    {</w:t>
-      </w:r>
-    </w:p>
-    <w:p>
-      <w:pPr>
-        <w:ind w:left="1134"/>
-        <w:rPr>
-          <w:lang w:val="ru-UA"/>
-        </w:rPr>
-      </w:pPr>
-      <w:r>
-        <w:rPr>
-          <w:lang w:val="ru-UA"/>
-        </w:rPr>
-        <w:t xml:space="preserve">        filteredList.Add(PizzaManager.Orders[i]);</w:t>
-      </w:r>
-    </w:p>
-    <w:p>
-      <w:pPr>
-        <w:ind w:left="1134"/>
-        <w:rPr>
-          <w:lang w:val="ru-UA"/>
-        </w:rPr>
-      </w:pPr>
-      <w:r>
-        <w:rPr>
-          <w:lang w:val="ru-UA"/>
-        </w:rPr>
-        <w:t xml:space="preserve">    }</w:t>
-      </w:r>
-    </w:p>
-    <w:p>
-      <w:pPr>
-        <w:ind w:left="1134"/>
-        <w:rPr>
-          <w:lang w:val="ru-UA"/>
-        </w:rPr>
-      </w:pPr>
-      <w:r>
-        <w:rPr>
-          <w:lang w:val="ru-UA"/>
-        </w:rPr>
-        <w:t>}</w:t>
-      </w:r>
-    </w:p>
-    <w:p>
-      <w:pPr>
-        <w:ind w:left="1134"/>
-        <w:rPr>
-          <w:lang w:val="ru-UA"/>
-        </w:rPr>
-      </w:pPr>
-      <w:r>
-        <w:rPr>
-          <w:lang w:val="ru-UA"/>
-        </w:rPr>
-        <w:t>dataGrid.ItemsSource = filteredList;</w:t>
-      </w:r>
-    </w:p>
-    <w:p>
-      <w:pPr>
-        <w:rPr>
-          <w:b/>
-          <w:bCs/>
-          <w:lang w:val="ru-RU"/>
+        <w:t xml:space="preserve"> </w:t>
+      </w:r>
+      <w:r>
+        <w:rPr>
+          <w:lang w:val="ru-UA"/>
+        </w:rPr>
+        <w:t>д</w:t>
+      </w:r>
+      <w:r>
+        <w:rPr>
+          <w:lang w:val="ru-UA"/>
+        </w:rPr>
+        <w:t xml:space="preserve">ля поиска не используются скрытые базы данных — поиск выполняется путем прямого перебора элементов массива в цикле for от 0 до Count </w:t>
+      </w:r>
+      <w:r>
+        <w:rPr>
+          <w:lang w:val="ru-UA"/>
+        </w:rPr>
+        <w:t>–</w:t>
+      </w:r>
+      <w:r>
+        <w:rPr>
+          <w:lang w:val="ru-UA"/>
+        </w:rPr>
+        <w:t xml:space="preserve"> 1</w:t>
+      </w:r>
+      <w:r>
+        <w:rPr>
+          <w:lang w:val="ru-UA"/>
+        </w:rPr>
+        <w:t xml:space="preserve"> используя </w:t>
+      </w:r>
+      <w:r>
+        <w:rPr>
+          <w:lang w:val="ru-UA"/>
+        </w:rPr>
+        <w:t>List&lt;PizzaOrder&gt;</w:t>
+      </w:r>
+      <w:r>
+        <w:rPr>
+          <w:lang w:val="ru-UA"/>
+        </w:rPr>
+        <w:t>.</w:t>
+      </w:r>
+    </w:p>
+    <w:p>
+      <w:pPr>
+        <w:rPr>
+          <w:b/>
+          <w:bCs/>
+          <w:lang w:val="ru-UA"/>
         </w:rPr>
       </w:pPr>
     </w:p>
@@ -4160,9 +3569,7 @@
     </w:p>
     <w:p>
       <w:pPr>
-        <w:tabs>
-          <w:tab w:val="num" w:pos="720"/>
-        </w:tabs>
+        <w:ind w:left="426"/>
         <w:rPr>
           <w:lang w:val="ru-UA"/>
         </w:rPr>
@@ -4179,154 +3586,6 @@
         </w:rPr>
         <w:t xml:space="preserve"> </w:t>
       </w:r>
-      <w:r>
-        <w:rPr>
-          <w:b/>
-          <w:bCs/>
-          <w:lang w:val="ru-UA"/>
-        </w:rPr>
-        <w:t>Пример:</w:t>
-      </w:r>
-    </w:p>
-    <w:p>
-      <w:pPr>
-        <w:ind w:left="1134"/>
-        <w:rPr>
-          <w:lang w:val="ru-UA"/>
-        </w:rPr>
-      </w:pPr>
-      <w:r>
-        <w:rPr>
-          <w:lang w:val="ru-UA"/>
-        </w:rPr>
-        <w:t>try</w:t>
-      </w:r>
-    </w:p>
-    <w:p>
-      <w:pPr>
-        <w:ind w:left="1134"/>
-        <w:rPr>
-          <w:lang w:val="ru-UA"/>
-        </w:rPr>
-      </w:pPr>
-      <w:r>
-        <w:rPr>
-          <w:lang w:val="ru-UA"/>
-        </w:rPr>
-        <w:t>{</w:t>
-      </w:r>
-    </w:p>
-    <w:p>
-      <w:pPr>
-        <w:ind w:left="1134"/>
-        <w:rPr>
-          <w:lang w:val="ru-UA"/>
-        </w:rPr>
-      </w:pPr>
-      <w:r>
-        <w:rPr>
-          <w:lang w:val="ru-UA"/>
-        </w:rPr>
-        <w:t xml:space="preserve">    PizzaManager.AddOrder(newOrder);</w:t>
-      </w:r>
-    </w:p>
-    <w:p>
-      <w:pPr>
-        <w:ind w:left="1134"/>
-        <w:rPr>
-          <w:lang w:val="ru-UA"/>
-        </w:rPr>
-      </w:pPr>
-      <w:r>
-        <w:rPr>
-          <w:lang w:val="ru-UA"/>
-        </w:rPr>
-        <w:t>}</w:t>
-      </w:r>
-    </w:p>
-    <w:p>
-      <w:pPr>
-        <w:ind w:left="1134"/>
-        <w:rPr>
-          <w:lang w:val="ru-UA"/>
-        </w:rPr>
-      </w:pPr>
-      <w:r>
-        <w:rPr>
-          <w:lang w:val="ru-UA"/>
-        </w:rPr>
-        <w:t>(DomainException ex)</w:t>
-      </w:r>
-    </w:p>
-    <w:p>
-      <w:pPr>
-        <w:ind w:left="1134"/>
-        <w:rPr>
-          <w:lang w:val="ru-UA"/>
-        </w:rPr>
-      </w:pPr>
-      <w:r>
-        <w:rPr>
-          <w:lang w:val="ru-UA"/>
-        </w:rPr>
-        <w:t>{</w:t>
-      </w:r>
-    </w:p>
-    <w:p>
-      <w:pPr>
-        <w:ind w:left="1134"/>
-        <w:rPr>
-          <w:lang w:val="ru-UA"/>
-        </w:rPr>
-      </w:pPr>
-      <w:r>
-        <w:rPr>
-          <w:lang w:val="ru-UA"/>
-        </w:rPr>
-        <w:t xml:space="preserve">    // Перехват специфического исключения Core</w:t>
-      </w:r>
-    </w:p>
-    <w:p>
-      <w:pPr>
-        <w:ind w:left="1134"/>
-        <w:rPr>
-          <w:lang w:val="ru-UA"/>
-        </w:rPr>
-      </w:pPr>
-      <w:r>
-        <w:rPr>
-          <w:lang w:val="ru-UA"/>
-        </w:rPr>
-        <w:t xml:space="preserve">    MessageBox.Show(Properties.Resources.ResourceManager.GetString(ex.Message), </w:t>
-      </w:r>
-    </w:p>
-    <w:p>
-      <w:pPr>
-        <w:ind w:left="1134"/>
-        <w:rPr>
-          <w:lang w:val="ru-UA"/>
-        </w:rPr>
-      </w:pPr>
-      <w:r>
-        <w:rPr>
-          <w:lang w:val="ru-UA"/>
-        </w:rPr>
-        <w:t xml:space="preserve">        "Ошибка валидации", MessageBoxButton.OK, MessageBoxImage.Error);</w:t>
-      </w:r>
-    </w:p>
-    <w:p>
-      <w:pPr>
-        <w:ind w:left="1134"/>
-        <w:rPr>
-          <w:lang w:val="ru-UA"/>
-        </w:rPr>
-      </w:pPr>
-      <w:r>
-        <w:rPr>
-          <w:lang w:val="ru-UA"/>
-        </w:rPr>
-        <w:t>}</w:t>
-      </w:r>
     </w:p>
     <w:p>
       <w:pPr>
@@ -4354,6 +3613,7 @@
     </w:p>
     <w:p>
       <w:pPr>
+        <w:ind w:left="426"/>
         <w:rPr>
           <w:lang w:val="ru-UA"/>
         </w:rPr>
@@ -4433,6 +3693,7 @@
     </w:p>
     <w:p>
       <w:pPr>
+        <w:ind w:left="426"/>
         <w:rPr>
           <w:lang w:val="ru-UA"/>
         </w:rPr>
@@ -4684,6 +3945,16 @@
     </w:p>
     <w:p>
       <w:pPr>
+        <w:tabs>
+          <w:tab w:val="left" w:pos="1985"/>
+        </w:tabs>
+        <w:rPr>
+          <w:lang w:val="ru-UA"/>
+        </w:rPr>
+      </w:pPr>
+    </w:p>
+    <w:p>
+      <w:pPr>
         <w:numPr>
           <w:ilvl w:val="0"/>
           <w:numId w:val="29"/>
@@ -4701,6 +3972,7 @@
           <w:bCs/>
           <w:lang w:val="ru-UA"/>
         </w:rPr>
+        <w:lastRenderedPageBreak/>
         <w:t>PizzaOrder.cs (Структура / struct)</w:t>
       </w:r>
     </w:p>
@@ -4825,7 +4097,6 @@
           <w:bCs/>
           <w:lang w:val="ru-UA"/>
         </w:rPr>
-        <w:lastRenderedPageBreak/>
         <w:t>PizzaManager.cs (Статический класс управления)</w:t>
       </w:r>
       <w:r>
@@ -5458,6 +4729,18 @@
           <w:lang w:val="ru-UA"/>
         </w:rPr>
       </w:pPr>
+    </w:p>
+    <w:p>
+      <w:pPr>
+        <w:tabs>
+          <w:tab w:val="left" w:pos="1985"/>
+        </w:tabs>
+        <w:rPr>
+          <w:b/>
+          <w:bCs/>
+          <w:lang w:val="ru-UA"/>
+        </w:rPr>
+      </w:pPr>
       <w:r>
         <w:rPr>
           <w:b/>
@@ -5534,14 +4817,6 @@
           <w:lang w:val="ru-UA"/>
         </w:rPr>
       </w:pPr>
-      <w:r>
-        <w:rPr>
-          <w:b/>
-          <w:bCs/>
-          <w:lang w:val="ru-UA"/>
-        </w:rPr>
-        <w:t>Требования к файлу README.md и три обязательных примера проверки:</w:t>
-      </w:r>
     </w:p>
     <w:p>
       <w:pPr>
@@ -5549,268 +4824,71 @@
           <w:tab w:val="left" w:pos="1206"/>
         </w:tabs>
         <w:rPr>
-          <w:lang w:val="ru-UA"/>
-        </w:rPr>
-      </w:pPr>
-      <w:r>
-        <w:rPr>
-          <w:lang w:val="ru-UA"/>
-        </w:rPr>
-        <w:t xml:space="preserve">Файл README.md в корне репозитория должен содержать краткое описание проекта, архитектурные допущения (например, выбор фиксированного массива на 100 элементов вместо динамических списков) и </w:t>
-      </w:r>
-      <w:r>
-        <w:rPr>
-          <w:b/>
-          <w:bCs/>
-          <w:lang w:val="ru-UA"/>
-        </w:rPr>
-        <w:t>три конкретных тест-кейса (примера проверки)</w:t>
-      </w:r>
-      <w:r>
-        <w:rPr>
-          <w:lang w:val="ru-UA"/>
-        </w:rPr>
-        <w:t xml:space="preserve"> для демонстрации преподавателю:</w:t>
-      </w:r>
-    </w:p>
-    <w:p>
-      <w:pPr>
-        <w:numPr>
-          <w:ilvl w:val="0"/>
-          <w:numId w:val="33"/>
-        </w:numPr>
+          <w:b/>
+          <w:bCs/>
+          <w:lang w:val="ru-UA"/>
+        </w:rPr>
+      </w:pPr>
+    </w:p>
+    <w:p>
+      <w:pPr>
         <w:tabs>
           <w:tab w:val="left" w:pos="1206"/>
         </w:tabs>
         <w:rPr>
-          <w:lang w:val="ru-UA"/>
-        </w:rPr>
-      </w:pPr>
-      <w:r>
-        <w:rPr>
-          <w:b/>
-          <w:bCs/>
-          <w:lang w:val="ru-UA"/>
-        </w:rPr>
-        <w:t>Пример проверки №1 (Успешный расчет по switch):</w:t>
-      </w:r>
+          <w:b/>
+          <w:bCs/>
+          <w:lang w:val="ru-UA"/>
+        </w:rPr>
+      </w:pPr>
     </w:p>
     <w:p>
       <w:pPr>
         <w:tabs>
           <w:tab w:val="left" w:pos="1206"/>
         </w:tabs>
-        <w:ind w:left="567"/>
-        <w:rPr>
-          <w:lang w:val="ru-UA"/>
-        </w:rPr>
-      </w:pPr>
-      <w:r>
-        <w:rPr>
-          <w:i/>
-          <w:iCs/>
-          <w:lang w:val="ru-UA"/>
-        </w:rPr>
-        <w:t>Входные данные:</w:t>
-      </w:r>
-      <w:r>
-        <w:rPr>
-          <w:lang w:val="ru-UA"/>
-        </w:rPr>
-        <w:t xml:space="preserve"> Выбран размер PizzaSize.Medium и тип теста DoughType.Traditional, количество соусов: 2.</w:t>
-      </w:r>
+        <w:rPr>
+          <w:b/>
+          <w:bCs/>
+          <w:lang w:val="ru-UA"/>
+        </w:rPr>
+      </w:pPr>
     </w:p>
     <w:p>
       <w:pPr>
         <w:tabs>
           <w:tab w:val="left" w:pos="1206"/>
         </w:tabs>
-        <w:ind w:left="567"/>
-        <w:rPr>
-          <w:lang w:val="ru-UA"/>
-        </w:rPr>
-      </w:pPr>
-      <w:r>
-        <w:rPr>
-          <w:i/>
-          <w:iCs/>
-          <w:lang w:val="ru-UA"/>
-        </w:rPr>
-        <w:t>Ожидаемый результат:</w:t>
-      </w:r>
-      <w:r>
-        <w:rPr>
-          <w:lang w:val="ru-UA"/>
-        </w:rPr>
-        <w:t xml:space="preserve"> Метод CalculatePriceAndPrepTime обрабатывает комбинацию через switch, добавляет стоимость 2 соусов и возвращает в таблице итоговую цену 12.50m и время приготовления 22 минуты.</w:t>
-      </w:r>
-    </w:p>
-    <w:p>
-      <w:pPr>
-        <w:numPr>
-          <w:ilvl w:val="0"/>
-          <w:numId w:val="33"/>
-        </w:numPr>
+        <w:rPr>
+          <w:b/>
+          <w:bCs/>
+          <w:lang w:val="ru-UA"/>
+        </w:rPr>
+      </w:pPr>
+    </w:p>
+    <w:p>
+      <w:pPr>
         <w:tabs>
           <w:tab w:val="left" w:pos="1206"/>
         </w:tabs>
         <w:rPr>
-          <w:lang w:val="ru-UA"/>
-        </w:rPr>
-      </w:pPr>
-      <w:r>
-        <w:rPr>
-          <w:b/>
-          <w:bCs/>
-          <w:lang w:val="ru-UA"/>
-        </w:rPr>
-        <w:t>Пример проверки №2 (Срабатывание бизнес-правила и DomainException):</w:t>
-      </w:r>
-    </w:p>
-    <w:p>
-      <w:pPr>
-        <w:ind w:left="567"/>
-        <w:rPr>
-          <w:lang w:val="ru-UA"/>
-        </w:rPr>
-      </w:pPr>
-      <w:r>
-        <w:rPr>
-          <w:i/>
-          <w:iCs/>
-          <w:lang w:val="ru-UA"/>
-        </w:rPr>
-        <w:t>Входные данные:</w:t>
-      </w:r>
-      <w:r>
-        <w:rPr>
-          <w:lang w:val="ru-UA"/>
-        </w:rPr>
-        <w:t xml:space="preserve"> Выбран размер PizzaSize.Small, а количество соусов вручную (в обход интерфейса) установлено равным 4.</w:t>
-      </w:r>
-    </w:p>
-    <w:p>
-      <w:pPr>
-        <w:ind w:left="567"/>
-        <w:rPr>
-          <w:lang w:val="ru-UA"/>
-        </w:rPr>
-      </w:pPr>
-      <w:r>
-        <w:rPr>
-          <w:i/>
-          <w:iCs/>
-          <w:lang w:val="ru-UA"/>
-        </w:rPr>
-        <w:t>Ожидаемый результат:</w:t>
-      </w:r>
-      <w:r>
-        <w:rPr>
-          <w:lang w:val="ru-UA"/>
-        </w:rPr>
-        <w:t xml:space="preserve"> Проект Core выбрасывает DomainException, WPF перехватывает его в блоке try-catch, обращается к Resources.resx и выводит MessageBox с предупреждением </w:t>
-      </w:r>
-      <w:r>
-        <w:rPr>
-          <w:i/>
-          <w:iCs/>
-          <w:lang w:val="ru-UA"/>
-        </w:rPr>
-        <w:t>"Для маленькой пиццы доступно максимум 3 соуса"</w:t>
-      </w:r>
-      <w:r>
-        <w:rPr>
-          <w:lang w:val="ru-UA"/>
-        </w:rPr>
-        <w:t>.</w:t>
-      </w:r>
-    </w:p>
-    <w:p>
-      <w:pPr>
-        <w:numPr>
-          <w:ilvl w:val="0"/>
-          <w:numId w:val="33"/>
-        </w:numPr>
+          <w:b/>
+          <w:bCs/>
+          <w:lang w:val="ru-UA"/>
+        </w:rPr>
+      </w:pPr>
+    </w:p>
+    <w:p>
+      <w:pPr>
         <w:tabs>
           <w:tab w:val="left" w:pos="1206"/>
         </w:tabs>
         <w:rPr>
-          <w:lang w:val="ru-UA"/>
-        </w:rPr>
-      </w:pPr>
-      <w:r>
-        <w:rPr>
-          <w:b/>
-          <w:bCs/>
-          <w:lang w:val="ru-UA"/>
-        </w:rPr>
-        <w:lastRenderedPageBreak/>
-        <w:t>Пример проверки №3 (Удаление заказа со сдвигом массива):</w:t>
-      </w:r>
-    </w:p>
-    <w:p>
-      <w:pPr>
-        <w:ind w:left="567"/>
-        <w:rPr>
-          <w:lang w:val="ru-UA"/>
-        </w:rPr>
-      </w:pPr>
-      <w:r>
-        <w:rPr>
-          <w:i/>
-          <w:iCs/>
-          <w:lang w:val="ru-UA"/>
-        </w:rPr>
-        <w:t>Входные данные:</w:t>
-      </w:r>
-      <w:r>
-        <w:rPr>
-          <w:lang w:val="ru-UA"/>
-        </w:rPr>
-        <w:t xml:space="preserve"> В таблице отображается 4 заказа (Count = 4). Пользователь выбирает второй заказ (индекс 1) и нажимает «Удалить».</w:t>
-      </w:r>
-    </w:p>
-    <w:p>
-      <w:pPr>
-        <w:ind w:left="567"/>
-        <w:rPr>
-          <w:lang w:val="ru-UA"/>
-        </w:rPr>
-      </w:pPr>
-      <w:r>
-        <w:rPr>
-          <w:i/>
-          <w:iCs/>
-          <w:lang w:val="ru-UA"/>
-        </w:rPr>
-        <w:t>Ожидаемый результат:</w:t>
-      </w:r>
-      <w:r>
-        <w:rPr>
-          <w:lang w:val="ru-UA"/>
-        </w:rPr>
-        <w:t xml:space="preserve"> Появляется диалоговое окно MessageBox с запросом подтверждения. При нажатии «Да» заказ стирается, срабатывает циклический сдвиг элементов влево, счетчик становится равным 3, а DataGrid обновляется и показывает только оставшиеся актуальные записи.</w:t>
-      </w:r>
-    </w:p>
-    <w:p>
-      <w:pPr>
-        <w:rPr>
-          <w:lang w:val="ru-UA"/>
-        </w:rPr>
-      </w:pPr>
-    </w:p>
-    <w:p>
-      <w:pPr>
-        <w:rPr>
-          <w:lang w:val="ru-UA"/>
-        </w:rPr>
-      </w:pPr>
-      <w:r>
-        <w:rPr>
-          <w:lang w:val="ru-UA"/>
-        </w:rPr>
-        <w:t>================================================================================</w:t>
-      </w:r>
+          <w:b/>
+          <w:bCs/>
+          <w:lang w:val="ru-UA"/>
+        </w:rPr>
+      </w:pPr>
     </w:p>
     <w:p>
       <w:pPr>
@@ -5818,18 +4896,27 @@
           <w:tab w:val="left" w:pos="1206"/>
         </w:tabs>
         <w:rPr>
-          <w:lang w:val="ru-UA"/>
-        </w:rPr>
-      </w:pPr>
-    </w:p>
-    <w:p>
-      <w:pPr>
-        <w:rPr>
-          <w:lang w:val="ru-UA"/>
-        </w:rPr>
-      </w:pPr>
-      <w:r>
-        <w:rPr>
+          <w:lang w:val="en-US"/>
+        </w:rPr>
+      </w:pPr>
+      <w:r>
+        <w:rPr>
+          <w:b/>
+          <w:bCs/>
+          <w:lang w:val="en-US"/>
+        </w:rPr>
+        <w:t>VIEWS:</w:t>
+      </w:r>
+    </w:p>
+    <w:p>
+      <w:pPr>
+        <w:rPr>
+          <w:lang w:val="ru-UA"/>
+        </w:rPr>
+      </w:pPr>
+      <w:r>
+        <w:rPr>
+          <w:noProof/>
           <w:lang w:val="ru-UA"/>
         </w:rPr>
         <w:drawing>
@@ -5877,9 +4964,9 @@
       </w:pPr>
       <w:r>
         <w:rPr>
+          <w:noProof/>
           <w:lang w:val="ru-RU"/>
         </w:rPr>
-        <w:lastRenderedPageBreak/>
         <w:drawing>
           <wp:inline distT="0" distB="0" distL="0" distR="0" wp14:anchorId="425BEEE6" wp14:editId="334134CD">
             <wp:extent cx="7052310" cy="4194175"/>
@@ -5925,8 +5012,10 @@
       </w:pPr>
       <w:r>
         <w:rPr>
+          <w:noProof/>
           <w:lang w:val="en-US"/>
         </w:rPr>
+        <w:lastRenderedPageBreak/>
         <w:drawing>
           <wp:inline distT="0" distB="0" distL="0" distR="0" wp14:anchorId="2548DF53" wp14:editId="6DF44FD9">
             <wp:extent cx="7052310" cy="4242435"/>
@@ -5972,9 +5061,9 @@
       </w:pPr>
       <w:r>
         <w:rPr>
+          <w:noProof/>
           <w:lang w:val="en-US"/>
         </w:rPr>
-        <w:lastRenderedPageBreak/>
         <w:drawing>
           <wp:inline distT="0" distB="0" distL="0" distR="0" wp14:anchorId="6B41BA46" wp14:editId="5C2C7B9B">
             <wp:extent cx="7052310" cy="4204970"/>
@@ -6020,8 +5109,10 @@
       </w:pPr>
       <w:r>
         <w:rPr>
+          <w:noProof/>
           <w:lang w:val="en-US"/>
         </w:rPr>
+        <w:lastRenderedPageBreak/>
         <w:drawing>
           <wp:inline distT="0" distB="0" distL="0" distR="0" wp14:anchorId="41227097" wp14:editId="311E0992">
             <wp:extent cx="7052310" cy="4209415"/>
@@ -6067,9 +5158,9 @@
       </w:pPr>
       <w:r>
         <w:rPr>
+          <w:noProof/>
           <w:lang w:val="en-US"/>
         </w:rPr>
-        <w:lastRenderedPageBreak/>
         <w:drawing>
           <wp:inline distT="0" distB="0" distL="0" distR="0" wp14:anchorId="0E34C62D" wp14:editId="0E96C873">
             <wp:extent cx="7052310" cy="4170680"/>
@@ -6115,8 +5206,10 @@
       </w:pPr>
       <w:r>
         <w:rPr>
+          <w:noProof/>
           <w:lang w:val="en-US"/>
         </w:rPr>
+        <w:lastRenderedPageBreak/>
         <w:drawing>
           <wp:inline distT="0" distB="0" distL="0" distR="0" wp14:anchorId="7F6F0D5F" wp14:editId="46BC1843">
             <wp:extent cx="7052310" cy="4234815"/>
@@ -11266,7 +10359,7 @@
   <w:style w:type="paragraph" w:default="1" w:styleId="a">
     <w:name w:val="Normal"/>
     <w:qFormat/>
-    <w:rsid w:val="00837F6B"/>
+    <w:rsid w:val="00371E32"/>
     <w:rPr>
       <w:lang w:val="et-EE"/>
     </w:rPr>

</xml_diff>